<commit_message>
Blog Post 7: add llmMethodology translations; update index.html card; remove rocket icon from overview; sort blog cards by date via app.js; verify multilingual support; prep Cloudflare Workers deployment configuration
</commit_message>
<xml_diff>
--- a/blog/Blog Post 6/Zokforce Insights Zokforce Insights - The New Era of AI Transformation.docx
+++ b/blog/Blog Post 6/Zokforce Insights Zokforce Insights - The New Era of AI Transformation.docx
@@ -339,7 +339,7 @@
                     <pic:cNvPicPr/>
                   </pic:nvPicPr>
                   <pic:blipFill>
-                    <a:blip r:embed="rId5">
+                    <a:blip r:embed="rId8">
                       <a:extLst>
                         <a:ext uri="{28A0092B-C50C-407E-A947-70E740481C1C}">
                           <a14:useLocalDpi xmlns:a14="http://schemas.microsoft.com/office/drawing/2010/main" val="0"/>
@@ -971,7 +971,7 @@
                     <pic:cNvPicPr/>
                   </pic:nvPicPr>
                   <pic:blipFill>
-                    <a:blip r:embed="rId6">
+                    <a:blip r:embed="rId9">
                       <a:extLst>
                         <a:ext uri="{28A0092B-C50C-407E-A947-70E740481C1C}">
                           <a14:useLocalDpi xmlns:a14="http://schemas.microsoft.com/office/drawing/2010/main" val="0"/>
@@ -1521,7 +1521,7 @@
                     <pic:cNvPicPr/>
                   </pic:nvPicPr>
                   <pic:blipFill>
-                    <a:blip r:embed="rId7">
+                    <a:blip r:embed="rId10">
                       <a:extLst>
                         <a:ext uri="{28A0092B-C50C-407E-A947-70E740481C1C}">
                           <a14:useLocalDpi xmlns:a14="http://schemas.microsoft.com/office/drawing/2010/main" val="0"/>
@@ -2354,12 +2354,10 @@
     <w:p>
       <w:pPr>
         <w:pStyle w:val="NormalWeb"/>
-        <w:rPr>
-          <w:rFonts w:hint="eastAsia"/>
-        </w:rPr>
       </w:pPr>
     </w:p>
     <w:sectPr>
+      <w:headerReference w:type="default" r:id="rId11"/>
       <w:pgSz w:w="12240" w:h="15840"/>
       <w:pgMar w:top="1440" w:right="1440" w:bottom="1440" w:left="1440" w:header="720" w:footer="720" w:gutter="0"/>
       <w:cols w:space="720"/>
@@ -2367,6 +2365,103 @@
     </w:sectPr>
   </w:body>
 </w:document>
+</file>
+
+<file path=word/endnotes.xml><?xml version="1.0" encoding="utf-8"?>
+<w:endnotes xmlns:wpc="http://schemas.microsoft.com/office/word/2010/wordprocessingCanvas" xmlns:cx="http://schemas.microsoft.com/office/drawing/2014/chartex" xmlns:cx1="http://schemas.microsoft.com/office/drawing/2015/9/8/chartex" xmlns:cx2="http://schemas.microsoft.com/office/drawing/2015/10/21/chartex" xmlns:cx3="http://schemas.microsoft.com/office/drawing/2016/5/9/chartex" xmlns:cx4="http://schemas.microsoft.com/office/drawing/2016/5/10/chartex" xmlns:cx5="http://schemas.microsoft.com/office/drawing/2016/5/11/chartex" xmlns:cx6="http://schemas.microsoft.com/office/drawing/2016/5/12/chartex" xmlns:cx7="http://schemas.microsoft.com/office/drawing/2016/5/13/chartex" xmlns:cx8="http://schemas.microsoft.com/office/drawing/2016/5/14/chartex" xmlns:mc="http://schemas.openxmlformats.org/markup-compatibility/2006" xmlns:aink="http://schemas.microsoft.com/office/drawing/2016/ink" xmlns:am3d="http://schemas.microsoft.com/office/drawing/2017/model3d" xmlns:o="urn:schemas-microsoft-com:office:office" xmlns:oel="http://schemas.microsoft.com/office/2019/extlst" xmlns:r="http://schemas.openxmlformats.org/officeDocument/2006/relationships" xmlns:m="http://schemas.openxmlformats.org/officeDocument/2006/math" xmlns:v="urn:schemas-microsoft-com:vml" xmlns:wp14="http://schemas.microsoft.com/office/word/2010/wordprocessingDrawing" xmlns:wp="http://schemas.openxmlformats.org/drawingml/2006/wordprocessingDrawing" xmlns:w10="urn:schemas-microsoft-com:office:word" xmlns:w="http://schemas.openxmlformats.org/wordprocessingml/2006/main" xmlns:w14="http://schemas.microsoft.com/office/word/2010/wordml" xmlns:w15="http://schemas.microsoft.com/office/word/2012/wordml" xmlns:w16cex="http://schemas.microsoft.com/office/word/2018/wordml/cex" xmlns:w16cid="http://schemas.microsoft.com/office/word/2016/wordml/cid" xmlns:w16="http://schemas.microsoft.com/office/word/2018/wordml" xmlns:w16du="http://schemas.microsoft.com/office/word/2023/wordml/word16du" xmlns:w16sdtdh="http://schemas.microsoft.com/office/word/2020/wordml/sdtdatahash" xmlns:w16sdtfl="http://schemas.microsoft.com/office/word/2024/wordml/sdtformatlock" xmlns:w16se="http://schemas.microsoft.com/office/word/2015/wordml/symex" xmlns:wpg="http://schemas.microsoft.com/office/word/2010/wordprocessingGroup" xmlns:wpi="http://schemas.microsoft.com/office/word/2010/wordprocessingInk" xmlns:wne="http://schemas.microsoft.com/office/word/2006/wordml" xmlns:wps="http://schemas.microsoft.com/office/word/2010/wordprocessingShape" mc:Ignorable="w14 w15 w16se w16cid w16 w16cex w16sdtdh w16sdtfl w16du wp14">
+  <w:endnote w:type="separator" w:id="-1">
+    <w:p>
+      <w:pPr>
+        <w:spacing w:after="0" w:line="240" w:lineRule="auto"/>
+      </w:pPr>
+      <w:r>
+        <w:separator/>
+      </w:r>
+    </w:p>
+  </w:endnote>
+  <w:endnote w:type="continuationSeparator" w:id="0">
+    <w:p>
+      <w:pPr>
+        <w:spacing w:after="0" w:line="240" w:lineRule="auto"/>
+      </w:pPr>
+      <w:r>
+        <w:continuationSeparator/>
+      </w:r>
+    </w:p>
+  </w:endnote>
+</w:endnotes>
+</file>
+
+<file path=word/footnotes.xml><?xml version="1.0" encoding="utf-8"?>
+<w:footnotes xmlns:wpc="http://schemas.microsoft.com/office/word/2010/wordprocessingCanvas" xmlns:cx="http://schemas.microsoft.com/office/drawing/2014/chartex" xmlns:cx1="http://schemas.microsoft.com/office/drawing/2015/9/8/chartex" xmlns:cx2="http://schemas.microsoft.com/office/drawing/2015/10/21/chartex" xmlns:cx3="http://schemas.microsoft.com/office/drawing/2016/5/9/chartex" xmlns:cx4="http://schemas.microsoft.com/office/drawing/2016/5/10/chartex" xmlns:cx5="http://schemas.microsoft.com/office/drawing/2016/5/11/chartex" xmlns:cx6="http://schemas.microsoft.com/office/drawing/2016/5/12/chartex" xmlns:cx7="http://schemas.microsoft.com/office/drawing/2016/5/13/chartex" xmlns:cx8="http://schemas.microsoft.com/office/drawing/2016/5/14/chartex" xmlns:mc="http://schemas.openxmlformats.org/markup-compatibility/2006" xmlns:aink="http://schemas.microsoft.com/office/drawing/2016/ink" xmlns:am3d="http://schemas.microsoft.com/office/drawing/2017/model3d" xmlns:o="urn:schemas-microsoft-com:office:office" xmlns:oel="http://schemas.microsoft.com/office/2019/extlst" xmlns:r="http://schemas.openxmlformats.org/officeDocument/2006/relationships" xmlns:m="http://schemas.openxmlformats.org/officeDocument/2006/math" xmlns:v="urn:schemas-microsoft-com:vml" xmlns:wp14="http://schemas.microsoft.com/office/word/2010/wordprocessingDrawing" xmlns:wp="http://schemas.openxmlformats.org/drawingml/2006/wordprocessingDrawing" xmlns:w10="urn:schemas-microsoft-com:office:word" xmlns:w="http://schemas.openxmlformats.org/wordprocessingml/2006/main" xmlns:w14="http://schemas.microsoft.com/office/word/2010/wordml" xmlns:w15="http://schemas.microsoft.com/office/word/2012/wordml" xmlns:w16cex="http://schemas.microsoft.com/office/word/2018/wordml/cex" xmlns:w16cid="http://schemas.microsoft.com/office/word/2016/wordml/cid" xmlns:w16="http://schemas.microsoft.com/office/word/2018/wordml" xmlns:w16du="http://schemas.microsoft.com/office/word/2023/wordml/word16du" xmlns:w16sdtdh="http://schemas.microsoft.com/office/word/2020/wordml/sdtdatahash" xmlns:w16sdtfl="http://schemas.microsoft.com/office/word/2024/wordml/sdtformatlock" xmlns:w16se="http://schemas.microsoft.com/office/word/2015/wordml/symex" xmlns:wpg="http://schemas.microsoft.com/office/word/2010/wordprocessingGroup" xmlns:wpi="http://schemas.microsoft.com/office/word/2010/wordprocessingInk" xmlns:wne="http://schemas.microsoft.com/office/word/2006/wordml" xmlns:wps="http://schemas.microsoft.com/office/word/2010/wordprocessingShape" mc:Ignorable="w14 w15 w16se w16cid w16 w16cex w16sdtdh w16sdtfl w16du wp14">
+  <w:footnote w:type="separator" w:id="-1">
+    <w:p>
+      <w:pPr>
+        <w:spacing w:after="0" w:line="240" w:lineRule="auto"/>
+      </w:pPr>
+      <w:r>
+        <w:separator/>
+      </w:r>
+    </w:p>
+  </w:footnote>
+  <w:footnote w:type="continuationSeparator" w:id="0">
+    <w:p>
+      <w:pPr>
+        <w:spacing w:after="0" w:line="240" w:lineRule="auto"/>
+      </w:pPr>
+      <w:r>
+        <w:continuationSeparator/>
+      </w:r>
+    </w:p>
+  </w:footnote>
+</w:footnotes>
+</file>
+
+<file path=word/header1.xml><?xml version="1.0" encoding="utf-8"?>
+<w:hdr xmlns:wpc="http://schemas.microsoft.com/office/word/2010/wordprocessingCanvas" xmlns:cx="http://schemas.microsoft.com/office/drawing/2014/chartex" xmlns:cx1="http://schemas.microsoft.com/office/drawing/2015/9/8/chartex" xmlns:cx2="http://schemas.microsoft.com/office/drawing/2015/10/21/chartex" xmlns:cx3="http://schemas.microsoft.com/office/drawing/2016/5/9/chartex" xmlns:cx4="http://schemas.microsoft.com/office/drawing/2016/5/10/chartex" xmlns:cx5="http://schemas.microsoft.com/office/drawing/2016/5/11/chartex" xmlns:cx6="http://schemas.microsoft.com/office/drawing/2016/5/12/chartex" xmlns:cx7="http://schemas.microsoft.com/office/drawing/2016/5/13/chartex" xmlns:cx8="http://schemas.microsoft.com/office/drawing/2016/5/14/chartex" xmlns:mc="http://schemas.openxmlformats.org/markup-compatibility/2006" xmlns:aink="http://schemas.microsoft.com/office/drawing/2016/ink" xmlns:am3d="http://schemas.microsoft.com/office/drawing/2017/model3d" xmlns:o="urn:schemas-microsoft-com:office:office" xmlns:oel="http://schemas.microsoft.com/office/2019/extlst" xmlns:r="http://schemas.openxmlformats.org/officeDocument/2006/relationships" xmlns:m="http://schemas.openxmlformats.org/officeDocument/2006/math" xmlns:v="urn:schemas-microsoft-com:vml" xmlns:wp14="http://schemas.microsoft.com/office/word/2010/wordprocessingDrawing" xmlns:wp="http://schemas.openxmlformats.org/drawingml/2006/wordprocessingDrawing" xmlns:w10="urn:schemas-microsoft-com:office:word" xmlns:w="http://schemas.openxmlformats.org/wordprocessingml/2006/main" xmlns:w14="http://schemas.microsoft.com/office/word/2010/wordml" xmlns:w15="http://schemas.microsoft.com/office/word/2012/wordml" xmlns:w16cex="http://schemas.microsoft.com/office/word/2018/wordml/cex" xmlns:w16cid="http://schemas.microsoft.com/office/word/2016/wordml/cid" xmlns:w16="http://schemas.microsoft.com/office/word/2018/wordml" xmlns:w16du="http://schemas.microsoft.com/office/word/2023/wordml/word16du" xmlns:w16sdtdh="http://schemas.microsoft.com/office/word/2020/wordml/sdtdatahash" xmlns:w16sdtfl="http://schemas.microsoft.com/office/word/2024/wordml/sdtformatlock" xmlns:w16se="http://schemas.microsoft.com/office/word/2015/wordml/symex" xmlns:wpg="http://schemas.microsoft.com/office/word/2010/wordprocessingGroup" xmlns:wpi="http://schemas.microsoft.com/office/word/2010/wordprocessingInk" xmlns:wne="http://schemas.microsoft.com/office/word/2006/wordml" xmlns:wps="http://schemas.microsoft.com/office/word/2010/wordprocessingShape" mc:Ignorable="w14 w15 w16se w16cid w16 w16cex w16sdtdh w16sdtfl w16du wp14">
+  <w:p>
+    <w:pPr>
+      <w:pStyle w:val="Header"/>
+    </w:pPr>
+    <w:r>
+      <w:drawing>
+        <wp:inline distT="0" distB="0" distL="0" distR="0" wp14:anchorId="57D22556" wp14:editId="7DA7181E">
+          <wp:extent cx="1336431" cy="448097"/>
+          <wp:effectExtent l="0" t="0" r="0" b="0"/>
+          <wp:docPr id="2038319638" name="Picture 1" descr="A blue and grey logo&#10;&#10;AI-generated content may be incorrect."/>
+          <wp:cNvGraphicFramePr>
+            <a:graphicFrameLocks xmlns:a="http://schemas.openxmlformats.org/drawingml/2006/main" noChangeAspect="1"/>
+          </wp:cNvGraphicFramePr>
+          <a:graphic xmlns:a="http://schemas.openxmlformats.org/drawingml/2006/main">
+            <a:graphicData uri="http://schemas.openxmlformats.org/drawingml/2006/picture">
+              <pic:pic xmlns:pic="http://schemas.openxmlformats.org/drawingml/2006/picture">
+                <pic:nvPicPr>
+                  <pic:cNvPr id="2038319638" name="Picture 1" descr="A blue and grey logo&#10;&#10;AI-generated content may be incorrect."/>
+                  <pic:cNvPicPr/>
+                </pic:nvPicPr>
+                <pic:blipFill>
+                  <a:blip r:embed="rId1"/>
+                  <a:stretch>
+                    <a:fillRect/>
+                  </a:stretch>
+                </pic:blipFill>
+                <pic:spPr>
+                  <a:xfrm>
+                    <a:off x="0" y="0"/>
+                    <a:ext cx="1407854" cy="472045"/>
+                  </a:xfrm>
+                  <a:prstGeom prst="rect">
+                    <a:avLst/>
+                  </a:prstGeom>
+                </pic:spPr>
+              </pic:pic>
+            </a:graphicData>
+          </a:graphic>
+        </wp:inline>
+      </w:drawing>
+    </w:r>
+  </w:p>
+</w:hdr>
 </file>
 
 <file path=word/numbering.xml><?xml version="1.0" encoding="utf-8"?>
@@ -4979,6 +5074,50 @@
     <w:basedOn w:val="DefaultParagraphFont"/>
     <w:rsid w:val="00E7170B"/>
   </w:style>
+  <w:style w:type="paragraph" w:styleId="Header">
+    <w:name w:val="header"/>
+    <w:basedOn w:val="Normal"/>
+    <w:link w:val="HeaderChar"/>
+    <w:uiPriority w:val="99"/>
+    <w:unhideWhenUsed/>
+    <w:rsid w:val="003C742A"/>
+    <w:pPr>
+      <w:tabs>
+        <w:tab w:val="center" w:pos="4680"/>
+        <w:tab w:val="right" w:pos="9360"/>
+      </w:tabs>
+      <w:spacing w:after="0" w:line="240" w:lineRule="auto"/>
+    </w:pPr>
+  </w:style>
+  <w:style w:type="character" w:customStyle="1" w:styleId="HeaderChar">
+    <w:name w:val="Header Char"/>
+    <w:basedOn w:val="DefaultParagraphFont"/>
+    <w:link w:val="Header"/>
+    <w:uiPriority w:val="99"/>
+    <w:rsid w:val="003C742A"/>
+  </w:style>
+  <w:style w:type="paragraph" w:styleId="Footer">
+    <w:name w:val="footer"/>
+    <w:basedOn w:val="Normal"/>
+    <w:link w:val="FooterChar"/>
+    <w:uiPriority w:val="99"/>
+    <w:unhideWhenUsed/>
+    <w:rsid w:val="003C742A"/>
+    <w:pPr>
+      <w:tabs>
+        <w:tab w:val="center" w:pos="4680"/>
+        <w:tab w:val="right" w:pos="9360"/>
+      </w:tabs>
+      <w:spacing w:after="0" w:line="240" w:lineRule="auto"/>
+    </w:pPr>
+  </w:style>
+  <w:style w:type="character" w:customStyle="1" w:styleId="FooterChar">
+    <w:name w:val="Footer Char"/>
+    <w:basedOn w:val="DefaultParagraphFont"/>
+    <w:link w:val="Footer"/>
+    <w:uiPriority w:val="99"/>
+    <w:rsid w:val="003C742A"/>
+  </w:style>
 </w:styles>
 </file>
 
@@ -5275,4 +5414,16 @@
     </a:ext>
   </a:extLst>
 </a:theme>
+</file>
+
+<file path=customXml/item1.xml><?xml version="1.0" encoding="utf-8"?>
+<b:Sources xmlns:b="http://schemas.openxmlformats.org/officeDocument/2006/bibliography" xmlns="http://schemas.openxmlformats.org/officeDocument/2006/bibliography" SelectedStyle="/APASixthEditionOfficeOnline.xsl" StyleName="APA" Version="6"/>
+</file>
+
+<file path=customXml/itemProps1.xml><?xml version="1.0" encoding="utf-8"?>
+<ds:datastoreItem xmlns:ds="http://schemas.openxmlformats.org/officeDocument/2006/customXml" ds:itemID="{74E01D4B-D224-C24A-AE42-377FE695D037}">
+  <ds:schemaRefs>
+    <ds:schemaRef ds:uri="http://schemas.openxmlformats.org/officeDocument/2006/bibliography"/>
+  </ds:schemaRefs>
+</ds:datastoreItem>
 </file>
</xml_diff>